<commit_message>
Remove Dr. Rayudu Srinivas from IEEE paper and add FEATURES_AND_PHASES.md
- Remove Dr. Rayudu Srinivas and Professor role from Lumina_IEEE_Research_Paper.docx
  (authors now: Chepuri Hari Kiran, Pathivada Laxmi Ram Charan)
- Add docs/FEATURES_AND_PHASES.md: comprehensive features and delivery roadmap
  covering all 8 phases (0-7), AI agent system, Handwriting Analysis module,
  cross-phase workstreams, release milestones, and definition of done

Co-Authored-By: Claude Sonnet 4.6 <noreply@anthropic.com>
</commit_message>
<xml_diff>
--- a/Lumina_IEEE_Research_Paper.docx
+++ b/Lumina_IEEE_Research_Paper.docx
@@ -16,38 +16,6 @@
           <w:szCs w:val="28"/>
         </w:rPr>
         <w:t xml:space="preserve">Lumina: An Intelligent Multi-Agent Adaptive Learning Management System with Bayesian Knowledge Tracing, Deep Knowledge Tracing, and Reinforcement Learning for Personalized Education</w:t>
-      </w:r>
-    </w:p>
-    <w:p>
-      <w:pPr>
-        <w:spacing w:after="40"/>
-        <w:jc w:val="center"/>
-      </w:pPr>
-      <w:r>
-        <w:rPr>
-          <w:rFonts w:ascii="Times New Roman" w:cs="Times New Roman" w:eastAsia="Times New Roman" w:hAnsi="Times New Roman"/>
-          <w:b/>
-          <w:bCs/>
-          <w:sz w:val="22"/>
-          <w:szCs w:val="22"/>
-        </w:rPr>
-        <w:t xml:space="preserve">Dr. Rayudu Srinivas</w:t>
-      </w:r>
-    </w:p>
-    <w:p>
-      <w:pPr>
-        <w:spacing w:after="40"/>
-        <w:jc w:val="center"/>
-      </w:pPr>
-      <w:r>
-        <w:rPr>
-          <w:rFonts w:ascii="Times New Roman" w:cs="Times New Roman" w:eastAsia="Times New Roman" w:hAnsi="Times New Roman"/>
-          <w:i/>
-          <w:iCs/>
-          <w:sz w:val="20"/>
-          <w:szCs w:val="20"/>
-        </w:rPr>
-        <w:t xml:space="preserve">Professor</w:t>
       </w:r>
     </w:p>
     <w:p>

</xml_diff>